<commit_message>
Proposal template v2: page breaks, date position, address/contact cells, uniform spacing
</commit_message>
<xml_diff>
--- a/Deck_ProposalTemplate.docx
+++ b/Deck_ProposalTemplate.docx
@@ -5,18 +5,6 @@
     <w:p>
       <w:pPr>
         <w:pStyle w:val="Default"/>
-      </w:pPr>
-    </w:p>
-    <w:p>
-      <w:pPr>
-        <w:pStyle w:val="Default"/>
-        <w:jc w:val="center"/>
-        <w:rPr>
-          <w:b/>
-          <w:bCs/>
-          <w:sz w:val="28"/>
-          <w:szCs w:val="28"/>
-        </w:rPr>
       </w:pPr>
     </w:p>
     <w:p>
@@ -162,23 +150,10 @@
         </w:p>
       </w:sdtContent>
     </w:sdt>
-    <w:p>
-      <w:pPr>
-        <w:jc w:val="center"/>
-        <w:rPr>
-          <w:b/>
-          <w:bCs/>
-          <w:caps/>
-          <w:color w:val="FF0000"/>
-          <w:sz w:val="28"/>
-          <w:szCs w:val="28"/>
-        </w:rPr>
-      </w:pPr>
-    </w:p>
     <w:tbl>
       <w:tblPr>
         <w:tblStyle w:val="TableGrid"/>
-        <w:tblpPr w:leftFromText="180" w:rightFromText="180" w:vertAnchor="page" w:horzAnchor="margin" w:tblpXSpec="right" w:tblpY="5191"/>
+        <w:tblpPr w:leftFromText="180" w:rightFromText="180" w:vertAnchor="page" w:horzAnchor="margin" w:tblpXSpec="right" w:tblpY="2750"/>
         <w:tblW w:w="0" w:type="auto"/>
         <w:tblBorders>
           <w:top w:val="none" w:sz="0" w:space="0" w:color="auto"/>
@@ -403,33 +378,13 @@
         </w:tc>
         <w:tc>
           <w:tcPr>
-            <w:tcW w:w="630" w:type="dxa"/>
+            <w:tcW w:w="1464" w:type="dxa"/>
             <w:tcBorders>
               <w:top w:val="single" w:sz="4" w:space="0" w:color="auto"/>
               <w:left w:val="single" w:sz="4" w:space="0" w:color="auto"/>
             </w:tcBorders>
             <w:vAlign w:val="bottom"/>
-          </w:tcPr>
-          <w:p>
-            <w:pPr>
-              <w:rPr>
-                <w:rStyle w:val="ReportFees"/>
-                <w:b/>
-                <w:bCs/>
-              </w:rPr>
-            </w:pPr>
-          </w:p>
-        </w:tc>
-        <w:tc>
-          <w:tcPr>
-            <w:tcW w:w="834" w:type="dxa"/>
-            <w:tcBorders>
-              <w:top w:val="single" w:sz="4" w:space="0" w:color="auto"/>
-              <w:left w:val="single" w:sz="4" w:space="0" w:color="auto"/>
-            </w:tcBorders>
-            <w:noWrap/>
-            <w:tcFitText/>
-            <w:vAlign w:val="bottom"/>
+            <w:gridSpan w:val="2"/>
           </w:tcPr>
           <w:p>
             <w:pPr>
@@ -532,8 +487,27 @@
         </w:tc>
         <w:tc>
           <w:tcPr>
-            <w:tcW w:w="7040" w:type="dxa"/>
-            <w:gridSpan w:val="4"/>
+            <w:tcW w:w="2878" w:type="dxa"/>
+            <w:tcBorders>
+              <w:left w:val="single" w:sz="4" w:space="0" w:color="auto"/>
+            </w:tcBorders>
+            <w:vAlign w:val="bottom"/>
+          </w:tcPr>
+          <w:p>
+            <w:pPr>
+              <w:rPr>
+                <w:rStyle w:val="ReportFees"/>
+                <w:b/>
+                <w:bCs/>
+                <w:color w:val="EE0000"/>
+              </w:rPr>
+            </w:pPr>
+          </w:p>
+        </w:tc>
+        <w:tc>
+          <w:tcPr>
+            <w:tcW w:w="4162" w:type="dxa"/>
+            <w:gridSpan w:val="3"/>
             <w:tcBorders>
               <w:left w:val="single" w:sz="4" w:space="0" w:color="auto"/>
             </w:tcBorders>
@@ -694,18 +668,6 @@
     </w:p>
     <w:p>
       <w:pPr>
-        <w:pStyle w:val="Default"/>
-        <w:rPr>
-          <w:rFonts w:asciiTheme="minorHAnsi" w:hAnsiTheme="minorHAnsi" w:cstheme="minorHAnsi"/>
-          <w:b/>
-          <w:bCs/>
-          <w:sz w:val="22"/>
-          <w:szCs w:val="22"/>
-        </w:rPr>
-      </w:pPr>
-    </w:p>
-    <w:p>
-      <w:pPr>
         <w:pStyle w:val="BodyText"/>
         <w:jc w:val="both"/>
         <w:rPr>
@@ -1502,62 +1464,7 @@
     </w:p>
     <w:p>
       <w:pPr>
-        <w:pStyle w:val="BodyText"/>
-        <w:jc w:val="both"/>
-        <w:rPr>
-          <w:rFonts w:asciiTheme="minorHAnsi" w:hAnsiTheme="minorHAnsi" w:cstheme="minorHAnsi"/>
-          <w:b/>
-          <w:bCs/>
-          <w:color w:val="FF0000"/>
-          <w:sz w:val="24"/>
-          <w:szCs w:val="24"/>
-        </w:rPr>
-      </w:pPr>
-    </w:p>
-    <w:p>
-      <w:pPr>
-        <w:pStyle w:val="BodyText"/>
-        <w:jc w:val="both"/>
-        <w:rPr>
-          <w:rFonts w:asciiTheme="minorHAnsi" w:hAnsiTheme="minorHAnsi" w:cstheme="minorHAnsi"/>
-          <w:b/>
-          <w:bCs/>
-          <w:color w:val="FF0000"/>
-          <w:sz w:val="24"/>
-          <w:szCs w:val="24"/>
-        </w:rPr>
-      </w:pPr>
-    </w:p>
-    <w:p>
-      <w:pPr>
-        <w:pStyle w:val="BodyText"/>
-        <w:jc w:val="both"/>
-        <w:rPr>
-          <w:rFonts w:asciiTheme="minorHAnsi" w:hAnsiTheme="minorHAnsi" w:cstheme="minorHAnsi"/>
-          <w:b/>
-          <w:bCs/>
-          <w:color w:val="FF0000"/>
-          <w:sz w:val="24"/>
-          <w:szCs w:val="24"/>
-        </w:rPr>
-      </w:pPr>
-    </w:p>
-    <w:p>
-      <w:pPr>
-        <w:pStyle w:val="BodyText"/>
-        <w:jc w:val="both"/>
-        <w:rPr>
-          <w:rFonts w:asciiTheme="minorHAnsi" w:hAnsiTheme="minorHAnsi" w:cstheme="minorHAnsi"/>
-          <w:b/>
-          <w:bCs/>
-          <w:color w:val="FF0000"/>
-          <w:sz w:val="24"/>
-          <w:szCs w:val="24"/>
-        </w:rPr>
-      </w:pPr>
-    </w:p>
-    <w:p>
-      <w:pPr>
+        <w:pageBreakBefore/>
         <w:pStyle w:val="BodyText"/>
         <w:jc w:val="both"/>
         <w:rPr>
@@ -3620,54 +3527,6 @@
         <w:spacing w:after="0" w:line="240" w:lineRule="auto"/>
         <w:rPr>
           <w:rFonts w:ascii="Calibri" w:hAnsi="Calibri" w:cs="Calibri"/>
-          <w:b/>
-          <w:bCs/>
-          <w:color w:val="000000"/>
-          <w:sz w:val="24"/>
-          <w:szCs w:val="24"/>
-        </w:rPr>
-      </w:pPr>
-    </w:p>
-    <w:p>
-      <w:pPr>
-        <w:autoSpaceDE w:val="0"/>
-        <w:autoSpaceDN w:val="0"/>
-        <w:adjustRightInd w:val="0"/>
-        <w:spacing w:after="0" w:line="240" w:lineRule="auto"/>
-        <w:rPr>
-          <w:rFonts w:ascii="Calibri" w:hAnsi="Calibri" w:cs="Calibri"/>
-          <w:b/>
-          <w:bCs/>
-          <w:color w:val="000000"/>
-          <w:sz w:val="24"/>
-          <w:szCs w:val="24"/>
-        </w:rPr>
-      </w:pPr>
-    </w:p>
-    <w:p>
-      <w:pPr>
-        <w:autoSpaceDE w:val="0"/>
-        <w:autoSpaceDN w:val="0"/>
-        <w:adjustRightInd w:val="0"/>
-        <w:spacing w:after="0" w:line="240" w:lineRule="auto"/>
-        <w:rPr>
-          <w:rFonts w:ascii="Calibri" w:hAnsi="Calibri" w:cs="Calibri"/>
-          <w:b/>
-          <w:bCs/>
-          <w:color w:val="000000"/>
-          <w:sz w:val="24"/>
-          <w:szCs w:val="24"/>
-        </w:rPr>
-      </w:pPr>
-    </w:p>
-    <w:p>
-      <w:pPr>
-        <w:autoSpaceDE w:val="0"/>
-        <w:autoSpaceDN w:val="0"/>
-        <w:adjustRightInd w:val="0"/>
-        <w:spacing w:after="0" w:line="240" w:lineRule="auto"/>
-        <w:rPr>
-          <w:rFonts w:ascii="Calibri" w:hAnsi="Calibri" w:cs="Calibri"/>
           <w:color w:val="000000"/>
           <w:sz w:val="24"/>
           <w:szCs w:val="24"/>
@@ -3817,18 +3676,7 @@
     </w:p>
     <w:p>
       <w:pPr>
-        <w:autoSpaceDE w:val="0"/>
-        <w:autoSpaceDN w:val="0"/>
-        <w:adjustRightInd w:val="0"/>
-        <w:spacing w:after="0" w:line="240" w:lineRule="auto"/>
-        <w:rPr>
-          <w:rFonts w:ascii="Calibri" w:hAnsi="Calibri" w:cs="Calibri"/>
-          <w:color w:val="000000"/>
-        </w:rPr>
-      </w:pPr>
-    </w:p>
-    <w:p>
-      <w:pPr>
+        <w:pageBreakBefore/>
         <w:autoSpaceDE w:val="0"/>
         <w:autoSpaceDN w:val="0"/>
         <w:adjustRightInd w:val="0"/>
@@ -4357,76 +4205,6 @@
         <w:spacing w:after="0" w:line="240" w:lineRule="auto"/>
         <w:rPr>
           <w:rFonts w:ascii="Calibri" w:eastAsia="Arial Unicode MS" w:hAnsi="Calibri" w:cs="Calibri"/>
-          <w:color w:val="EC7C30"/>
-          <w:sz w:val="24"/>
-          <w:szCs w:val="24"/>
-        </w:rPr>
-      </w:pPr>
-    </w:p>
-    <w:p>
-      <w:pPr>
-        <w:autoSpaceDE w:val="0"/>
-        <w:autoSpaceDN w:val="0"/>
-        <w:adjustRightInd w:val="0"/>
-        <w:spacing w:after="0" w:line="240" w:lineRule="auto"/>
-        <w:rPr>
-          <w:rFonts w:ascii="Calibri" w:eastAsia="Arial Unicode MS" w:hAnsi="Calibri" w:cs="Calibri"/>
-          <w:color w:val="EC7C30"/>
-          <w:sz w:val="24"/>
-          <w:szCs w:val="24"/>
-        </w:rPr>
-      </w:pPr>
-    </w:p>
-    <w:p>
-      <w:pPr>
-        <w:autoSpaceDE w:val="0"/>
-        <w:autoSpaceDN w:val="0"/>
-        <w:adjustRightInd w:val="0"/>
-        <w:spacing w:after="0" w:line="240" w:lineRule="auto"/>
-        <w:rPr>
-          <w:rFonts w:ascii="Calibri" w:eastAsia="Arial Unicode MS" w:hAnsi="Calibri" w:cs="Calibri"/>
-          <w:color w:val="EC7C30"/>
-          <w:sz w:val="24"/>
-          <w:szCs w:val="24"/>
-        </w:rPr>
-      </w:pPr>
-    </w:p>
-    <w:p>
-      <w:pPr>
-        <w:autoSpaceDE w:val="0"/>
-        <w:autoSpaceDN w:val="0"/>
-        <w:adjustRightInd w:val="0"/>
-        <w:spacing w:after="0" w:line="240" w:lineRule="auto"/>
-        <w:rPr>
-          <w:rFonts w:ascii="Calibri" w:eastAsia="Arial Unicode MS" w:hAnsi="Calibri" w:cs="Calibri"/>
-          <w:color w:val="EC7C30"/>
-          <w:sz w:val="24"/>
-          <w:szCs w:val="24"/>
-        </w:rPr>
-      </w:pPr>
-    </w:p>
-    <w:p>
-      <w:pPr>
-        <w:autoSpaceDE w:val="0"/>
-        <w:autoSpaceDN w:val="0"/>
-        <w:adjustRightInd w:val="0"/>
-        <w:spacing w:after="0" w:line="240" w:lineRule="auto"/>
-        <w:rPr>
-          <w:rFonts w:ascii="Calibri" w:eastAsia="Arial Unicode MS" w:hAnsi="Calibri" w:cs="Calibri"/>
-          <w:color w:val="EC7C30"/>
-          <w:sz w:val="24"/>
-          <w:szCs w:val="24"/>
-        </w:rPr>
-      </w:pPr>
-    </w:p>
-    <w:p>
-      <w:pPr>
-        <w:autoSpaceDE w:val="0"/>
-        <w:autoSpaceDN w:val="0"/>
-        <w:adjustRightInd w:val="0"/>
-        <w:spacing w:after="0" w:line="240" w:lineRule="auto"/>
-        <w:rPr>
-          <w:rFonts w:ascii="Calibri" w:eastAsia="Arial Unicode MS" w:hAnsi="Calibri" w:cs="Calibri"/>
           <w:color w:val="000000"/>
           <w:sz w:val="24"/>
           <w:szCs w:val="24"/>
@@ -4776,32 +4554,7 @@
     </w:p>
     <w:p>
       <w:pPr>
-        <w:autoSpaceDE w:val="0"/>
-        <w:autoSpaceDN w:val="0"/>
-        <w:adjustRightInd w:val="0"/>
-        <w:spacing w:after="0" w:line="240" w:lineRule="auto"/>
-        <w:jc w:val="both"/>
-        <w:rPr>
-          <w:rFonts w:ascii="Calibri" w:eastAsia="Arial Unicode MS" w:hAnsi="Calibri" w:cs="Calibri"/>
-          <w:color w:val="000000"/>
-        </w:rPr>
-      </w:pPr>
-    </w:p>
-    <w:p>
-      <w:pPr>
-        <w:autoSpaceDE w:val="0"/>
-        <w:autoSpaceDN w:val="0"/>
-        <w:adjustRightInd w:val="0"/>
-        <w:spacing w:after="0" w:line="240" w:lineRule="auto"/>
-        <w:jc w:val="both"/>
-        <w:rPr>
-          <w:rFonts w:ascii="Calibri" w:eastAsia="Arial Unicode MS" w:hAnsi="Calibri" w:cs="Calibri"/>
-          <w:color w:val="000000"/>
-        </w:rPr>
-      </w:pPr>
-    </w:p>
-    <w:p>
-      <w:pPr>
+        <w:pageBreakBefore/>
         <w:pStyle w:val="BodyText"/>
         <w:rPr>
           <w:rFonts w:asciiTheme="minorHAnsi" w:hAnsiTheme="minorHAnsi" w:cstheme="minorHAnsi"/>
@@ -5880,18 +5633,6 @@
           <w:rFonts w:asciiTheme="minorHAnsi" w:hAnsiTheme="minorHAnsi" w:cstheme="minorHAnsi"/>
           <w:b/>
           <w:bCs/>
-          <w:sz w:val="24"/>
-          <w:szCs w:val="24"/>
-        </w:rPr>
-      </w:pPr>
-    </w:p>
-    <w:p>
-      <w:pPr>
-        <w:pStyle w:val="BodyText"/>
-        <w:rPr>
-          <w:rFonts w:asciiTheme="minorHAnsi" w:hAnsiTheme="minorHAnsi" w:cstheme="minorHAnsi"/>
-          <w:b/>
-          <w:bCs/>
           <w:spacing w:val="-2"/>
           <w:sz w:val="24"/>
           <w:szCs w:val="24"/>
@@ -6521,15 +6262,6 @@
         </w:rPr>
         <w:t xml:space="preserve"> </w:t>
       </w:r>
-    </w:p>
-    <w:p>
-      <w:pPr>
-        <w:jc w:val="both"/>
-        <w:rPr>
-          <w:rFonts w:cstheme="minorHAnsi"/>
-          <w:spacing w:val="40"/>
-        </w:rPr>
-      </w:pPr>
     </w:p>
     <w:p>
       <w:pPr>

</xml_diff>